<commit_message>
Kapsam: zincir kararına eksik model parçaları eklendi
Adım 5 kira kilidi maliyet metni, site ve rapora bağlandı. Kök pytest hekis ve mahsup yollarını görür; zincir tüm testi koşar.

Co-authored-by: saydamonur2002-tech <saydamonur2002-tech@users.noreply.github.com>
</commit_message>
<xml_diff>
--- a/TEK_SISTEM_SORUN_COZUM.docx
+++ b/TEK_SISTEM_SORUN_COZUM.docx
@@ -26,13 +26,13 @@
           <w:i/>
           <w:sz w:val="20"/>
         </w:rPr>
-        <w:t>Zarar Teorisi deposu — 2026-10-12</w:t>
+        <w:t>Zarar Teorisi deposu — 2026-10-17</w:t>
         <w:br/>
       </w:r>
     </w:p>
     <w:p>
       <w:r>
-        <w:t>Bu belge politika reçetesi değildir. Ölçüm, üst sınır, varsayım, tahmin ve senaryo ayrı durur. Bir katmanın sonucu diğerinin sonuç sütununa yazılmaz; yalnız etiketiyle girdi olur. Kilitli dosyalar (adim1_stok silinen, adim4 senet, üç kapı, akış 0,4270) boş/modellenmedi kalır. Sayılar 12 Ekim 2026 koşusuna bağlıdır; yenilemek için adim1_nace.py … test_bes_adim.py sırasına bakın.</w:t>
+        <w:t>Bu belge politika reçetesi değildir. Ölçüm, üst sınır, varsayım, tahmin ve senaryo ayrı durur. Bir katmanın sonucu diğerinin sonuç sütununa yazılmaz; yalnız etiketiyle girdi olur. Kilitli dosyalar (adim1_stok silinen, adim4 senet, üç kapı, akış 0,4210) boş/modellenmedi kalır. Sayılar 12 Ekim 2026 koşusuna bağlıdır; yenilemek için adim1_nace.py … test_bes_adim.py sırasına bakın.</w:t>
       </w:r>
     </w:p>
     <w:p>
@@ -141,7 +141,7 @@
     </w:p>
     <w:p>
       <w:r>
-        <w:t>TCMB birim kira (değerlemesi yapılan konut, 2026-Q2): 258,45 TL/m²/ay; yıllık değişim 35,2 yüzde. 90–110 m² için kiracı başına piyasa 23.260–28.430 TL/ay. HEKİS havuz kirası 20.000 TL/ay (modellendi). Tek sistem kira kolu birincil ölçülmedi (kiracı hane × ödenen kira); satır olculmedi durur. TÜFE yıllık 2026-09: yüzde 29,73.</w:t>
+        <w:t>TCMB birim kira (değerlemesi yapılan konut, 2026-Q3): 275,37 TL/m²/ay; yıllık değişim 32,0 yüzde. 90–110 m² için kiracı başına piyasa 24.783–30.291 TL/ay. HEKİS havuz kirası 20.000 TL/ay (modellendi). Tek sistem kira kolu birincil ölçülmedi (kiracı hane × ödenen kira); satır olculmedi durur. TÜFE yıllık 2026-09: yüzde 29,73.</w:t>
       </w:r>
     </w:p>
     <w:p>
@@ -534,7 +534,7 @@
           </w:tcPr>
           <w:p>
             <w:r>
-              <w:t>TP.BK.TR 2026-Q2</w:t>
+              <w:t>TP.BK.TR 2026-Q3</w:t>
             </w:r>
           </w:p>
         </w:tc>
@@ -544,7 +544,7 @@
           </w:tcPr>
           <w:p>
             <w:r>
-              <w:t>258,45 TL/m²/ay</w:t>
+              <w:t>275,37 TL/m²/ay</w:t>
             </w:r>
           </w:p>
         </w:tc>
@@ -1933,7 +1933,7 @@
     </w:p>
     <w:p>
       <w:r>
-        <w:t>Konut topluma açılırsa (HEKİS) politika kirası piyasanın altına iner. Kiracı (Ha) kazanır, ev sahibi (Ho) kaybeder; hane toplam NL değişmez. Kurumsal ev sahibi (F) payı ölçülmedi. Birim kira ölçüm: 258,45 TL/m²/ay. Alan 90–110 m² ve kiracı oranı 0,25–0,30 varsayım; hane sayısı 26,4 milyon elle (doğrulanmadı). Yol A yıllık kira akışı 1.842,2–2.701,9 milyar. Depodaki konut_stok proxy’si 255 milyar: finansal varlık payıdır, yol A ile toplanmaz.</w:t>
+        <w:t>Konut topluma açılırsa (HEKİS) politika kirası piyasanın altına iner. Kiracı (Ha) kazanır, ev sahibi (Ho) kaybeder; hane toplam NL değişmez. Kurumsal ev sahibi (F) payı ölçülmedi. Birim kira ölçüm: 275,37 TL/m²/ay. Alan 90–110 m² ve kiracı oranı 0,25–0,30 varsayım; hane sayısı 26.977.795 elle (doğrulanmadı). Yol A yıllık kira akışı 2.005,8–2.941,8 milyar. Depodaki konut_stok proxy’si 255 milyar: finansal varlık payıdır, yol A ile toplanmaz.</w:t>
       </w:r>
     </w:p>
     <w:tbl>
@@ -2019,7 +2019,7 @@
           </w:tcPr>
           <w:p>
             <w:r>
-              <w:t>258,45</w:t>
+              <w:t>275,37</w:t>
             </w:r>
           </w:p>
         </w:tc>
@@ -2029,7 +2029,7 @@
           </w:tcPr>
           <w:p>
             <w:r>
-              <w:t>258,45</w:t>
+              <w:t>275,37</w:t>
             </w:r>
           </w:p>
         </w:tc>
@@ -2061,7 +2061,7 @@
           </w:tcPr>
           <w:p>
             <w:r>
-              <w:t>23.260</w:t>
+              <w:t>24.783</w:t>
             </w:r>
           </w:p>
         </w:tc>
@@ -2071,7 +2071,7 @@
           </w:tcPr>
           <w:p>
             <w:r>
-              <w:t>28.430</w:t>
+              <w:t>30.291</w:t>
             </w:r>
           </w:p>
         </w:tc>
@@ -2145,7 +2145,7 @@
           </w:tcPr>
           <w:p>
             <w:r>
-              <w:t>3.260</w:t>
+              <w:t>4.783</w:t>
             </w:r>
           </w:p>
         </w:tc>
@@ -2155,7 +2155,7 @@
           </w:tcPr>
           <w:p>
             <w:r>
-              <w:t>8.430</w:t>
+              <w:t>10.291</w:t>
             </w:r>
           </w:p>
         </w:tc>
@@ -2187,7 +2187,7 @@
           </w:tcPr>
           <w:p>
             <w:r>
-              <w:t>1.842,2</w:t>
+              <w:t>2.005,8</w:t>
             </w:r>
           </w:p>
         </w:tc>
@@ -2197,7 +2197,7 @@
           </w:tcPr>
           <w:p>
             <w:r>
-              <w:t>2.701,9</w:t>
+              <w:t>2.941,8</w:t>
             </w:r>
           </w:p>
         </w:tc>
@@ -2229,7 +2229,7 @@
           </w:tcPr>
           <w:p>
             <w:r>
-              <w:t>51,6</w:t>
+              <w:t>77,4</w:t>
             </w:r>
           </w:p>
         </w:tc>
@@ -2239,7 +2239,7 @@
           </w:tcPr>
           <w:p>
             <w:r>
-              <w:t>160,2</w:t>
+              <w:t>199,9</w:t>
             </w:r>
           </w:p>
         </w:tc>
@@ -2271,7 +2271,7 @@
           </w:tcPr>
           <w:p>
             <w:r>
-              <w:t>129,1</w:t>
+              <w:t>193,6</w:t>
             </w:r>
           </w:p>
         </w:tc>
@@ -2281,7 +2281,7 @@
           </w:tcPr>
           <w:p>
             <w:r>
-              <w:t>400,6</w:t>
+              <w:t>499,7</w:t>
             </w:r>
           </w:p>
         </w:tc>
@@ -2313,7 +2313,7 @@
           </w:tcPr>
           <w:p>
             <w:r>
-              <w:t>258,2</w:t>
+              <w:t>387,1</w:t>
             </w:r>
           </w:p>
         </w:tc>
@@ -2323,7 +2323,7 @@
           </w:tcPr>
           <w:p>
             <w:r>
-              <w:t>801,1</w:t>
+              <w:t>999,4</w:t>
             </w:r>
           </w:p>
         </w:tc>
@@ -2342,7 +2342,7 @@
     <w:p/>
     <w:p>
       <w:r>
-        <w:t>Yüzde 20 burada kiracı kapsamasıdır (adım 1’deki silinen oranından başka nesne). Kiracıların beşte biri girerse ev sahibinden kiracıya yılda 52–160 milyar geçer. adim5.csv kira satırı olculmedi kalır.</w:t>
+        <w:t>Yüzde 20 burada kiracı kapsamasıdır (adım 1’deki silinen oranından başka nesne). Kiracıların beşte biri girerse ev sahibinden kiracıya yılda 77,4–199,9 milyar geçer. adim5.csv kira satırı olculmedi kalır.</w:t>
       </w:r>
     </w:p>
     <w:p>

</xml_diff>